<commit_message>
Fase 2 replicada en la instancia usac-g3 (Odoo 20)
El script 01 instala CRM, Inventario y Compras. Los scripts 05 y 10
buscan el NIT con y sin guion, porque Odoo 20 lo guarda sin guion.
Productos.xlsx apunta a las imágenes de la nueva instancia. El Manual
Técnico y el zip de entrega tienen la URL, la base, la versión y la
fecha de entrega actualizadas.
</commit_message>
<xml_diff>
--- a/Manual_Tecnico_UrbanJungle.docx
+++ b/Manual_Tecnico_UrbanJungle.docx
@@ -96,7 +96,7 @@
                     </pic:cNvPicPr>
                   </pic:nvPicPr>
                   <pic:blipFill>
-                    <a:blip r:embed="rId9" cstate="none"/>
+                    <a:blip r:embed="rId10" cstate="none"/>
                     <a:srcRect/>
                     <a:stretch>
                       <a:fillRect/>
@@ -249,7 +249,7 @@
           <w:sz w:val="20"/>
           <w:szCs w:val="20"/>
         </w:rPr>
-        <w:t xml:space="preserve">Guatemala, 2 de octubre de 2026</w:t>
+        <w:t xml:space="preserve">Guatemala, 17 de octubre de 2026</w:t>
       </w:r>
     </w:p>
     <w:p>
@@ -547,7 +547,7 @@
                 <w:sz w:val="19"/>
                 <w:szCs w:val="19"/>
               </w:rPr>
-              <w:t xml:space="preserve">https://usac.odoo.com</w:t>
+              <w:t xml:space="preserve">https://usac-g3.odoo.com</w:t>
             </w:r>
           </w:p>
         </w:tc>
@@ -617,7 +617,7 @@
                 <w:sz w:val="19"/>
                 <w:szCs w:val="19"/>
               </w:rPr>
-              <w:t xml:space="preserve">usac</w:t>
+              <w:t xml:space="preserve">usac-g3</w:t>
             </w:r>
           </w:p>
         </w:tc>
@@ -687,7 +687,7 @@
                 <w:sz w:val="19"/>
                 <w:szCs w:val="19"/>
               </w:rPr>
-              <w:t xml:space="preserve">Odoo Online (SaaS) Enterprise, serie 19.4</w:t>
+              <w:t xml:space="preserve">Odoo Online (SaaS) Enterprise, versión 20.0</w:t>
             </w:r>
           </w:p>
         </w:tc>
@@ -7669,7 +7669,7 @@
                     </pic:cNvPicPr>
                   </pic:nvPicPr>
                   <pic:blipFill>
-                    <a:blip r:embed="rId10" cstate="none"/>
+                    <a:blip r:embed="rId11" cstate="none"/>
                     <a:srcRect/>
                     <a:stretch>
                       <a:fillRect/>
@@ -8145,7 +8145,7 @@
           <w:sz w:val="20"/>
           <w:szCs w:val="20"/>
         </w:rPr>
-        <w:t xml:space="preserve">Se instaló el módulo CRM (Ventas, Inventario, Compras y Contabilidad ya estaban activos).</w:t>
+        <w:t xml:space="preserve">Se instalaron Inventario y Compras; Ventas, CRM y Contabilidad ya estaban activos en la base.</w:t>
       </w:r>
     </w:p>
     <w:p>
@@ -13630,7 +13630,7 @@
                 <w:sz w:val="17"/>
                 <w:szCs w:val="17"/>
               </w:rPr>
-              <w:t xml:space="preserve">4521873-0</w:t>
+              <w:t xml:space="preserve">45218730</w:t>
             </w:r>
           </w:p>
         </w:tc>
@@ -13793,7 +13793,7 @@
                 <w:sz w:val="17"/>
                 <w:szCs w:val="17"/>
               </w:rPr>
-              <w:t xml:space="preserve">6817342-3</w:t>
+              <w:t xml:space="preserve">68173423</w:t>
             </w:r>
           </w:p>
         </w:tc>
@@ -13955,7 +13955,7 @@
                 <w:sz w:val="17"/>
                 <w:szCs w:val="17"/>
               </w:rPr>
-              <w:t xml:space="preserve">3389015-3</w:t>
+              <w:t xml:space="preserve">33890153</w:t>
             </w:r>
           </w:p>
         </w:tc>
@@ -14118,7 +14118,7 @@
                 <w:sz w:val="17"/>
                 <w:szCs w:val="17"/>
               </w:rPr>
-              <w:t xml:space="preserve">8102457-6</w:t>
+              <w:t xml:space="preserve">81024576</w:t>
             </w:r>
           </w:p>
         </w:tc>
@@ -14280,7 +14280,7 @@
                 <w:sz w:val="17"/>
                 <w:szCs w:val="17"/>
               </w:rPr>
-              <w:t xml:space="preserve">2976431-9</w:t>
+              <w:t xml:space="preserve">29764319</w:t>
             </w:r>
           </w:p>
         </w:tc>
@@ -14443,7 +14443,7 @@
                 <w:sz w:val="17"/>
                 <w:szCs w:val="17"/>
               </w:rPr>
-              <w:t xml:space="preserve">5730186-7</w:t>
+              <w:t xml:space="preserve">57301867</w:t>
             </w:r>
           </w:p>
         </w:tc>
@@ -14605,7 +14605,7 @@
                 <w:sz w:val="17"/>
                 <w:szCs w:val="17"/>
               </w:rPr>
-              <w:t xml:space="preserve">7364520-6</w:t>
+              <w:t xml:space="preserve">73645206</w:t>
             </w:r>
           </w:p>
         </w:tc>
@@ -14768,7 +14768,7 @@
                 <w:sz w:val="17"/>
                 <w:szCs w:val="17"/>
               </w:rPr>
-              <w:t xml:space="preserve">1958742-2</w:t>
+              <w:t xml:space="preserve">19587422</w:t>
             </w:r>
           </w:p>
         </w:tc>
@@ -14930,7 +14930,7 @@
                 <w:sz w:val="17"/>
                 <w:szCs w:val="17"/>
               </w:rPr>
-              <w:t xml:space="preserve">4415609-K</w:t>
+              <w:t xml:space="preserve">4415609K</w:t>
             </w:r>
           </w:p>
         </w:tc>
@@ -15093,7 +15093,7 @@
                 <w:sz w:val="17"/>
                 <w:szCs w:val="17"/>
               </w:rPr>
-              <w:t xml:space="preserve">6093318-6</w:t>
+              <w:t xml:space="preserve">60933186</w:t>
             </w:r>
           </w:p>
         </w:tc>
@@ -15255,7 +15255,7 @@
                 <w:sz w:val="17"/>
                 <w:szCs w:val="17"/>
               </w:rPr>
-              <w:t xml:space="preserve">3027764-7</w:t>
+              <w:t xml:space="preserve">30277647</w:t>
             </w:r>
           </w:p>
         </w:tc>
@@ -15418,7 +15418,7 @@
                 <w:sz w:val="17"/>
                 <w:szCs w:val="17"/>
               </w:rPr>
-              <w:t xml:space="preserve">2580491-K</w:t>
+              <w:t xml:space="preserve">2580491K</w:t>
             </w:r>
           </w:p>
         </w:tc>
@@ -15580,7 +15580,7 @@
                 <w:sz w:val="17"/>
                 <w:szCs w:val="17"/>
               </w:rPr>
-              <w:t xml:space="preserve">9146205-3</w:t>
+              <w:t xml:space="preserve">91462053</w:t>
             </w:r>
           </w:p>
         </w:tc>
@@ -15743,7 +15743,7 @@
                 <w:sz w:val="17"/>
                 <w:szCs w:val="17"/>
               </w:rPr>
-              <w:t xml:space="preserve">5508923-2</w:t>
+              <w:t xml:space="preserve">55089232</w:t>
             </w:r>
           </w:p>
         </w:tc>
@@ -15905,7 +15905,7 @@
                 <w:sz w:val="17"/>
                 <w:szCs w:val="17"/>
               </w:rPr>
-              <w:t xml:space="preserve">7781046-5</w:t>
+              <w:t xml:space="preserve">77810465</w:t>
             </w:r>
           </w:p>
         </w:tc>
@@ -16068,7 +16068,7 @@
                 <w:sz w:val="17"/>
                 <w:szCs w:val="17"/>
               </w:rPr>
-              <w:t xml:space="preserve">3652870-6</w:t>
+              <w:t xml:space="preserve">36528706</w:t>
             </w:r>
           </w:p>
         </w:tc>
@@ -16230,7 +16230,7 @@
                 <w:sz w:val="17"/>
                 <w:szCs w:val="17"/>
               </w:rPr>
-              <w:t xml:space="preserve">8820357-3</w:t>
+              <w:t xml:space="preserve">88203573</w:t>
             </w:r>
           </w:p>
         </w:tc>
@@ -16393,7 +16393,7 @@
                 <w:sz w:val="17"/>
                 <w:szCs w:val="17"/>
               </w:rPr>
-              <w:t xml:space="preserve">1407683-7</w:t>
+              <w:t xml:space="preserve">14076837</w:t>
             </w:r>
           </w:p>
         </w:tc>
@@ -16555,7 +16555,7 @@
                 <w:sz w:val="17"/>
                 <w:szCs w:val="17"/>
               </w:rPr>
-              <w:t xml:space="preserve">6239015-5</w:t>
+              <w:t xml:space="preserve">62390155</w:t>
             </w:r>
           </w:p>
         </w:tc>
@@ -16718,7 +16718,7 @@
                 <w:sz w:val="17"/>
                 <w:szCs w:val="17"/>
               </w:rPr>
-              <w:t xml:space="preserve">4970528-8</w:t>
+              <w:t xml:space="preserve">49705288</w:t>
             </w:r>
           </w:p>
         </w:tc>
@@ -17117,7 +17117,7 @@
                 <w:sz w:val="16"/>
                 <w:szCs w:val="16"/>
               </w:rPr>
-              <w:t xml:space="preserve">4106385-6</w:t>
+              <w:t xml:space="preserve">41063856</w:t>
             </w:r>
           </w:p>
         </w:tc>
@@ -17310,7 +17310,7 @@
                 <w:sz w:val="16"/>
                 <w:szCs w:val="16"/>
               </w:rPr>
-              <w:t xml:space="preserve">2738460-8</w:t>
+              <w:t xml:space="preserve">27384608</w:t>
             </w:r>
           </w:p>
         </w:tc>
@@ -17505,7 +17505,7 @@
                 <w:sz w:val="16"/>
                 <w:szCs w:val="16"/>
               </w:rPr>
-              <w:t xml:space="preserve">1845372-4</w:t>
+              <w:t xml:space="preserve">18453724</w:t>
             </w:r>
           </w:p>
         </w:tc>
@@ -17698,7 +17698,7 @@
                 <w:sz w:val="16"/>
                 <w:szCs w:val="16"/>
               </w:rPr>
-              <w:t xml:space="preserve">3170594-4</w:t>
+              <w:t xml:space="preserve">31705944</w:t>
             </w:r>
           </w:p>
         </w:tc>
@@ -17893,7 +17893,7 @@
                 <w:sz w:val="16"/>
                 <w:szCs w:val="16"/>
               </w:rPr>
-              <w:t xml:space="preserve">3917024-1</w:t>
+              <w:t xml:space="preserve">39170241</w:t>
             </w:r>
           </w:p>
         </w:tc>
@@ -18086,7 +18086,7 @@
                 <w:sz w:val="16"/>
                 <w:szCs w:val="16"/>
               </w:rPr>
-              <w:t xml:space="preserve">1592846-2</w:t>
+              <w:t xml:space="preserve">15928462</w:t>
             </w:r>
           </w:p>
         </w:tc>
@@ -18281,7 +18281,7 @@
                 <w:sz w:val="16"/>
                 <w:szCs w:val="16"/>
               </w:rPr>
-              <w:t xml:space="preserve">6630497-0</w:t>
+              <w:t xml:space="preserve">66304970</w:t>
             </w:r>
           </w:p>
         </w:tc>
@@ -18474,7 +18474,7 @@
                 <w:sz w:val="16"/>
                 <w:szCs w:val="16"/>
               </w:rPr>
-              <w:t xml:space="preserve">2468139-3</w:t>
+              <w:t xml:space="preserve">24681393</w:t>
             </w:r>
           </w:p>
         </w:tc>
@@ -18669,7 +18669,7 @@
                 <w:sz w:val="16"/>
                 <w:szCs w:val="16"/>
               </w:rPr>
-              <w:t xml:space="preserve">2915038-8</w:t>
+              <w:t xml:space="preserve">29150388</w:t>
             </w:r>
           </w:p>
         </w:tc>
@@ -18862,7 +18862,7 @@
                 <w:sz w:val="16"/>
                 <w:szCs w:val="16"/>
               </w:rPr>
-              <w:t xml:space="preserve">5389127-9</w:t>
+              <w:t xml:space="preserve">53891279</w:t>
             </w:r>
           </w:p>
         </w:tc>
@@ -19057,7 +19057,7 @@
                 <w:sz w:val="16"/>
                 <w:szCs w:val="16"/>
               </w:rPr>
-              <w:t xml:space="preserve">3561290-8</w:t>
+              <w:t xml:space="preserve">35612908</w:t>
             </w:r>
           </w:p>
         </w:tc>
@@ -19250,7 +19250,7 @@
                 <w:sz w:val="16"/>
                 <w:szCs w:val="16"/>
               </w:rPr>
-              <w:t xml:space="preserve">5806147-9</w:t>
+              <w:t xml:space="preserve">58061479</w:t>
             </w:r>
           </w:p>
         </w:tc>
@@ -19445,7 +19445,7 @@
                 <w:sz w:val="16"/>
                 <w:szCs w:val="16"/>
               </w:rPr>
-              <w:t xml:space="preserve">7031846-8</w:t>
+              <w:t xml:space="preserve">70318468</w:t>
             </w:r>
           </w:p>
         </w:tc>
@@ -19638,7 +19638,7 @@
                 <w:sz w:val="16"/>
                 <w:szCs w:val="16"/>
               </w:rPr>
-              <w:t xml:space="preserve">4893015-6</w:t>
+              <w:t xml:space="preserve">48930156</w:t>
             </w:r>
           </w:p>
         </w:tc>
@@ -19833,7 +19833,7 @@
                 <w:sz w:val="16"/>
                 <w:szCs w:val="16"/>
               </w:rPr>
-              <w:t xml:space="preserve">1983470-5</w:t>
+              <w:t xml:space="preserve">19834705</w:t>
             </w:r>
           </w:p>
         </w:tc>
@@ -20026,7 +20026,7 @@
                 <w:sz w:val="16"/>
                 <w:szCs w:val="16"/>
               </w:rPr>
-              <w:t xml:space="preserve">4370582-0</w:t>
+              <w:t xml:space="preserve">43705820</w:t>
             </w:r>
           </w:p>
         </w:tc>
@@ -20221,7 +20221,7 @@
                 <w:sz w:val="16"/>
                 <w:szCs w:val="16"/>
               </w:rPr>
-              <w:t xml:space="preserve">7458102-3</w:t>
+              <w:t xml:space="preserve">74581023</w:t>
             </w:r>
           </w:p>
         </w:tc>
@@ -20414,7 +20414,7 @@
                 <w:sz w:val="16"/>
                 <w:szCs w:val="16"/>
               </w:rPr>
-              <w:t xml:space="preserve">7915264-3</w:t>
+              <w:t xml:space="preserve">79152643</w:t>
             </w:r>
           </w:p>
         </w:tc>
@@ -20609,7 +20609,7 @@
                 <w:sz w:val="16"/>
                 <w:szCs w:val="16"/>
               </w:rPr>
-              <w:t xml:space="preserve">6297015-1</w:t>
+              <w:t xml:space="preserve">62970151</w:t>
             </w:r>
           </w:p>
         </w:tc>
@@ -20802,7 +20802,7 @@
                 <w:sz w:val="16"/>
                 <w:szCs w:val="16"/>
               </w:rPr>
-              <w:t xml:space="preserve">2845019-1</w:t>
+              <w:t xml:space="preserve">28450191</w:t>
             </w:r>
           </w:p>
         </w:tc>
@@ -20997,7 +20997,7 @@
                 <w:sz w:val="16"/>
                 <w:szCs w:val="16"/>
               </w:rPr>
-              <w:t xml:space="preserve">4250916-5</w:t>
+              <w:t xml:space="preserve">42509165</w:t>
             </w:r>
           </w:p>
         </w:tc>
@@ -21190,7 +21190,7 @@
                 <w:sz w:val="16"/>
                 <w:szCs w:val="16"/>
               </w:rPr>
-              <w:t xml:space="preserve">1624793-0</w:t>
+              <w:t xml:space="preserve">16247930</w:t>
             </w:r>
           </w:p>
         </w:tc>
@@ -21385,7 +21385,7 @@
                 <w:sz w:val="16"/>
                 <w:szCs w:val="16"/>
               </w:rPr>
-              <w:t xml:space="preserve">4682093-0</w:t>
+              <w:t xml:space="preserve">46820930</w:t>
             </w:r>
           </w:p>
         </w:tc>
@@ -21578,7 +21578,7 @@
                 <w:sz w:val="16"/>
                 <w:szCs w:val="16"/>
               </w:rPr>
-              <w:t xml:space="preserve">5143928-K</w:t>
+              <w:t xml:space="preserve">5143928K</w:t>
             </w:r>
           </w:p>
         </w:tc>
@@ -21773,7 +21773,7 @@
                 <w:sz w:val="16"/>
                 <w:szCs w:val="16"/>
               </w:rPr>
-              <w:t xml:space="preserve">3047285-7</w:t>
+              <w:t xml:space="preserve">30472857</w:t>
             </w:r>
           </w:p>
         </w:tc>
@@ -21966,7 +21966,7 @@
                 <w:sz w:val="16"/>
                 <w:szCs w:val="16"/>
               </w:rPr>
-              <w:t xml:space="preserve">6025731-8</w:t>
+              <w:t xml:space="preserve">60257318</w:t>
             </w:r>
           </w:p>
         </w:tc>
@@ -22161,7 +22161,7 @@
                 <w:sz w:val="16"/>
                 <w:szCs w:val="16"/>
               </w:rPr>
-              <w:t xml:space="preserve">3824601-5</w:t>
+              <w:t xml:space="preserve">38246015</w:t>
             </w:r>
           </w:p>
         </w:tc>
@@ -22354,7 +22354,7 @@
                 <w:sz w:val="16"/>
                 <w:szCs w:val="16"/>
               </w:rPr>
-              <w:t xml:space="preserve">5274813-8</w:t>
+              <w:t xml:space="preserve">52748138</w:t>
             </w:r>
           </w:p>
         </w:tc>
@@ -22549,7 +22549,7 @@
                 <w:sz w:val="16"/>
                 <w:szCs w:val="16"/>
               </w:rPr>
-              <w:t xml:space="preserve">2209638-8</w:t>
+              <w:t xml:space="preserve">22096388</w:t>
             </w:r>
           </w:p>
         </w:tc>
@@ -22742,7 +22742,7 @@
                 <w:sz w:val="16"/>
                 <w:szCs w:val="16"/>
               </w:rPr>
-              <w:t xml:space="preserve">6573910-8</w:t>
+              <w:t xml:space="preserve">65739108</w:t>
             </w:r>
           </w:p>
         </w:tc>
@@ -27346,7 +27346,7 @@
                 <w:sz w:val="18"/>
                 <w:szCs w:val="18"/>
               </w:rPr>
-              <w:t xml:space="preserve">Lombricompost Chimaltenango</w:t>
+              <w:t xml:space="preserve">Agroinsumos La Cosecha, S.A.</w:t>
             </w:r>
           </w:p>
         </w:tc>
@@ -27439,7 +27439,7 @@
                 <w:sz w:val="18"/>
                 <w:szCs w:val="18"/>
               </w:rPr>
-              <w:t xml:space="preserve">Q696.96</w:t>
+              <w:t xml:space="preserve">Q740.52</w:t>
             </w:r>
           </w:p>
         </w:tc>
@@ -27671,7 +27671,7 @@
                 <w:sz w:val="18"/>
                 <w:szCs w:val="18"/>
               </w:rPr>
-              <w:t xml:space="preserve">Agroexportadora Verde Maya, S.A.</w:t>
+              <w:t xml:space="preserve">Tropical Plants Guatemala, S.A.</w:t>
             </w:r>
           </w:p>
         </w:tc>
@@ -27764,7 +27764,7 @@
                 <w:sz w:val="18"/>
                 <w:szCs w:val="18"/>
               </w:rPr>
-              <w:t xml:space="preserve">Q3,500.16</w:t>
+              <w:t xml:space="preserve">Q3,646.00</w:t>
             </w:r>
           </w:p>
         </w:tc>
@@ -27833,7 +27833,7 @@
                 <w:sz w:val="18"/>
                 <w:szCs w:val="18"/>
               </w:rPr>
-              <w:t xml:space="preserve">Empaques Kraft de Guatemala, S.A.</w:t>
+              <w:t xml:space="preserve">Fertilizantes Orgánicos del Altiplano</w:t>
             </w:r>
           </w:p>
         </w:tc>
@@ -27929,7 +27929,7 @@
                 <w:sz w:val="18"/>
                 <w:szCs w:val="18"/>
               </w:rPr>
-              <w:t xml:space="preserve">Q1,416.96</w:t>
+              <w:t xml:space="preserve">Q1,446.48</w:t>
             </w:r>
           </w:p>
         </w:tc>
@@ -28841,7 +28841,7 @@
                     </pic:cNvPicPr>
                   </pic:nvPicPr>
                   <pic:blipFill>
-                    <a:blip r:embed="rId11" cstate="none"/>
+                    <a:blip r:embed="rId12" cstate="none"/>
                     <a:srcRect/>
                     <a:stretch>
                       <a:fillRect/>
@@ -28919,7 +28919,7 @@
                     </pic:cNvPicPr>
                   </pic:nvPicPr>
                   <pic:blipFill>
-                    <a:blip r:embed="rId12" cstate="none"/>
+                    <a:blip r:embed="rId13" cstate="none"/>
                     <a:srcRect/>
                     <a:stretch>
                       <a:fillRect/>
@@ -28990,7 +28990,7 @@
         </w:rPr>
         <w:t xml:space="preserve">El video está en </w:t>
       </w:r>
-      <w:hyperlink w:history="1" r:id="rIdz2hbaj8ubdvhygkni1z6j">
+      <w:hyperlink w:history="1" r:id="rIdsogf01-bgs-wkc4dkqxzk">
         <w:r>
           <w:rPr>
             <w:rStyle w:val="Hyperlink"/>
@@ -32920,6 +32920,21 @@
     <w:name w:val="Normal"/>
     <w:qFormat/>
   </w:style>
+  <w:style w:type="table" w:styleId="TableNormal" w:default="true">
+    <w:name w:val="Normal Table"/>
+    <w:uiPriority w:val="99"/>
+    <w:semiHidden/>
+    <w:unhideWhenUsed/>
+    <w:tblPr>
+      <w:tblInd w:type="dxa" w:w="0"/>
+      <w:tblCellMar>
+        <w:top w:type="dxa" w:w="0"/>
+        <w:left w:type="dxa" w:w="108"/>
+        <w:bottom w:type="dxa" w:w="0"/>
+        <w:right w:type="dxa" w:w="108"/>
+      </w:tblCellMar>
+    </w:tblPr>
+  </w:style>
   <w:style w:type="paragraph" w:styleId="Title">
     <w:name w:val="Title"/>
     <w:basedOn w:val="Normal"/>

</xml_diff>